<commit_message>
Redact live object IDs, correct the licence, and sharpen the banner
The sys.login_token example pasted real output, so two Entra object IDs from the
tenant we tested in ended up in a repository that is about to be public. They are
identifiers rather than credentials, but they belong to a real directory and add
nothing to the example. Replaced with obvious placeholders.

Both READMEs claimed MIT while the LICENSE file is BSD 2-Clause. The file governs,
so the README now matches it. Worth a second look if MIT was the intent, since the
fix should then be to the licence file instead.

The warning banner said what this is not without saying what it is for. It now
states the purpose, that the measurements come from one workload on the cheapest
tier, and points at the options document, so a reader arriving at the repository
first is not left to infer the scope.
</commit_message>
<xml_diff>
--- a/docs/resolving-entra-group-membership.docx
+++ b/docs/resolving-entra-group-membership.docx
@@ -1767,7 +1767,7 @@
         <w:rPr>
           <w:rStyle w:val="VerbatimChar"/>
         </w:rPr>
-        <w:t xml:space="preserve">2ED2D8F6-7699-420A-A090-9F4139F3B2E1  WINDOWS GROUP  DENY ONLY</w:t>
+        <w:t xml:space="preserve">11111111-2222-3333-4444-555555555555  WINDOWS GROUP  DENY ONLY</w:t>
       </w:r>
       <w:r>
         <w:br/>
@@ -1776,7 +1776,7 @@
         <w:rPr>
           <w:rStyle w:val="VerbatimChar"/>
         </w:rPr>
-        <w:t xml:space="preserve">C3A6DB5E-DC48-47DD-994F-B856AEBD22E4  WINDOWS GROUP  DENY ONLY</w:t>
+        <w:t xml:space="preserve">66666666-7777-8888-9999-aaaaaaaaaaaa  WINDOWS GROUP  DENY ONLY</w:t>
       </w:r>
     </w:p>
     <w:p>

</xml_diff>